<commit_message>
Sprememba vaja 3 dodani dokazi
</commit_message>
<xml_diff>
--- a/DanielGrozdanovic/Vaja3/daniel_grozdanovic_dokazi_nal3.docx
+++ b/DanielGrozdanovic/Vaja3/daniel_grozdanovic_dokazi_nal3.docx
@@ -45,7 +45,178 @@
       </w:r>
     </w:p>
     <w:p>
-      <w:hyperlink r:id="rId5" w:history="1">
+      <w:r>
+        <w:rPr>
+          <w:noProof/>
+        </w:rPr>
+        <w:drawing>
+          <wp:inline distT="0" distB="0" distL="0" distR="0" wp14:anchorId="22603993" wp14:editId="608D8980">
+            <wp:extent cx="4076700" cy="1104900"/>
+            <wp:effectExtent l="0" t="0" r="0" b="0"/>
+            <wp:docPr id="895089308" name="Picture 1"/>
+            <wp:cNvGraphicFramePr>
+              <a:graphicFrameLocks xmlns:a="http://schemas.openxmlformats.org/drawingml/2006/main" noChangeAspect="1"/>
+            </wp:cNvGraphicFramePr>
+            <a:graphic xmlns:a="http://schemas.openxmlformats.org/drawingml/2006/main">
+              <a:graphicData uri="http://schemas.openxmlformats.org/drawingml/2006/picture">
+                <pic:pic xmlns:pic="http://schemas.openxmlformats.org/drawingml/2006/picture">
+                  <pic:nvPicPr>
+                    <pic:cNvPr id="895089308" name=""/>
+                    <pic:cNvPicPr/>
+                  </pic:nvPicPr>
+                  <pic:blipFill>
+                    <a:blip r:embed="rId5"/>
+                    <a:stretch>
+                      <a:fillRect/>
+                    </a:stretch>
+                  </pic:blipFill>
+                  <pic:spPr>
+                    <a:xfrm>
+                      <a:off x="0" y="0"/>
+                      <a:ext cx="4076700" cy="1104900"/>
+                    </a:xfrm>
+                    <a:prstGeom prst="rect">
+                      <a:avLst/>
+                    </a:prstGeom>
+                  </pic:spPr>
+                </pic:pic>
+              </a:graphicData>
+            </a:graphic>
+          </wp:inline>
+        </w:drawing>
+      </w:r>
+    </w:p>
+    <w:p>
+      <w:r>
+        <w:rPr>
+          <w:noProof/>
+        </w:rPr>
+        <w:drawing>
+          <wp:inline distT="0" distB="0" distL="0" distR="0" wp14:anchorId="0FBC5CC4" wp14:editId="35C84BDF">
+            <wp:extent cx="5760720" cy="2032000"/>
+            <wp:effectExtent l="0" t="0" r="0" b="6350"/>
+            <wp:docPr id="1824639576" name="Picture 1"/>
+            <wp:cNvGraphicFramePr>
+              <a:graphicFrameLocks xmlns:a="http://schemas.openxmlformats.org/drawingml/2006/main" noChangeAspect="1"/>
+            </wp:cNvGraphicFramePr>
+            <a:graphic xmlns:a="http://schemas.openxmlformats.org/drawingml/2006/main">
+              <a:graphicData uri="http://schemas.openxmlformats.org/drawingml/2006/picture">
+                <pic:pic xmlns:pic="http://schemas.openxmlformats.org/drawingml/2006/picture">
+                  <pic:nvPicPr>
+                    <pic:cNvPr id="1824639576" name=""/>
+                    <pic:cNvPicPr/>
+                  </pic:nvPicPr>
+                  <pic:blipFill>
+                    <a:blip r:embed="rId6"/>
+                    <a:stretch>
+                      <a:fillRect/>
+                    </a:stretch>
+                  </pic:blipFill>
+                  <pic:spPr>
+                    <a:xfrm>
+                      <a:off x="0" y="0"/>
+                      <a:ext cx="5760720" cy="2032000"/>
+                    </a:xfrm>
+                    <a:prstGeom prst="rect">
+                      <a:avLst/>
+                    </a:prstGeom>
+                  </pic:spPr>
+                </pic:pic>
+              </a:graphicData>
+            </a:graphic>
+          </wp:inline>
+        </w:drawing>
+      </w:r>
+    </w:p>
+    <w:p/>
+    <w:p>
+      <w:r>
+        <w:rPr>
+          <w:noProof/>
+        </w:rPr>
+        <w:lastRenderedPageBreak/>
+        <w:drawing>
+          <wp:inline distT="0" distB="0" distL="0" distR="0" wp14:anchorId="386C2850" wp14:editId="2C8B4560">
+            <wp:extent cx="5760720" cy="2170430"/>
+            <wp:effectExtent l="0" t="0" r="0" b="1270"/>
+            <wp:docPr id="113886878" name="Picture 1"/>
+            <wp:cNvGraphicFramePr>
+              <a:graphicFrameLocks xmlns:a="http://schemas.openxmlformats.org/drawingml/2006/main" noChangeAspect="1"/>
+            </wp:cNvGraphicFramePr>
+            <a:graphic xmlns:a="http://schemas.openxmlformats.org/drawingml/2006/main">
+              <a:graphicData uri="http://schemas.openxmlformats.org/drawingml/2006/picture">
+                <pic:pic xmlns:pic="http://schemas.openxmlformats.org/drawingml/2006/picture">
+                  <pic:nvPicPr>
+                    <pic:cNvPr id="113886878" name=""/>
+                    <pic:cNvPicPr/>
+                  </pic:nvPicPr>
+                  <pic:blipFill>
+                    <a:blip r:embed="rId7"/>
+                    <a:stretch>
+                      <a:fillRect/>
+                    </a:stretch>
+                  </pic:blipFill>
+                  <pic:spPr>
+                    <a:xfrm>
+                      <a:off x="0" y="0"/>
+                      <a:ext cx="5760720" cy="2170430"/>
+                    </a:xfrm>
+                    <a:prstGeom prst="rect">
+                      <a:avLst/>
+                    </a:prstGeom>
+                  </pic:spPr>
+                </pic:pic>
+              </a:graphicData>
+            </a:graphic>
+          </wp:inline>
+        </w:drawing>
+      </w:r>
+    </w:p>
+    <w:p/>
+    <w:p>
+      <w:r>
+        <w:rPr>
+          <w:noProof/>
+        </w:rPr>
+        <w:drawing>
+          <wp:inline distT="0" distB="0" distL="0" distR="0" wp14:anchorId="3FC0793F" wp14:editId="0EDAE9C1">
+            <wp:extent cx="5760720" cy="2237740"/>
+            <wp:effectExtent l="0" t="0" r="0" b="0"/>
+            <wp:docPr id="978183870" name="Picture 1"/>
+            <wp:cNvGraphicFramePr>
+              <a:graphicFrameLocks xmlns:a="http://schemas.openxmlformats.org/drawingml/2006/main" noChangeAspect="1"/>
+            </wp:cNvGraphicFramePr>
+            <a:graphic xmlns:a="http://schemas.openxmlformats.org/drawingml/2006/main">
+              <a:graphicData uri="http://schemas.openxmlformats.org/drawingml/2006/picture">
+                <pic:pic xmlns:pic="http://schemas.openxmlformats.org/drawingml/2006/picture">
+                  <pic:nvPicPr>
+                    <pic:cNvPr id="978183870" name=""/>
+                    <pic:cNvPicPr/>
+                  </pic:nvPicPr>
+                  <pic:blipFill>
+                    <a:blip r:embed="rId8"/>
+                    <a:stretch>
+                      <a:fillRect/>
+                    </a:stretch>
+                  </pic:blipFill>
+                  <pic:spPr>
+                    <a:xfrm>
+                      <a:off x="0" y="0"/>
+                      <a:ext cx="5760720" cy="2237740"/>
+                    </a:xfrm>
+                    <a:prstGeom prst="rect">
+                      <a:avLst/>
+                    </a:prstGeom>
+                  </pic:spPr>
+                </pic:pic>
+              </a:graphicData>
+            </a:graphic>
+          </wp:inline>
+        </w:drawing>
+      </w:r>
+    </w:p>
+    <w:p>
+      <w:hyperlink r:id="rId9" w:history="1">
         <w:r>
           <w:rPr>
             <w:rStyle w:val="Hyperlink"/>

</xml_diff>